<commit_message>
Commit rendered examples documentation
</commit_message>
<xml_diff>
--- a/examples/anomalies/doc/01-baseline-hanr_histogram.docx
+++ b/examples/anomalies/doc/01-baseline-hanr_histogram.docx
@@ -2,7 +2,7 @@
 <file path=word/document.xml><?xml version="1.0" encoding="utf-8"?>
 <w:document xmlns:w="http://schemas.openxmlformats.org/wordprocessingml/2006/main" xmlns:m="http://schemas.openxmlformats.org/officeDocument/2006/math" xmlns:r="http://schemas.openxmlformats.org/officeDocument/2006/relationships" xmlns:o="urn:schemas-microsoft-com:office:office" xmlns:v="urn:schemas-microsoft-com:vml" xmlns:w10="urn:schemas-microsoft-com:office:word" xmlns:a="http://schemas.openxmlformats.org/drawingml/2006/main" xmlns:pic="http://schemas.openxmlformats.org/drawingml/2006/picture" xmlns:wp="http://schemas.openxmlformats.org/drawingml/2006/wordprocessingDrawing">
   <w:body>
-    <w:bookmarkStart w:id="20" w:name="objective"/>
+    <w:bookmarkStart w:id="9" w:name="objective"/>
     <w:p>
       <w:pPr>
         <w:pStyle w:val="Heading2"/>
@@ -31,8 +31,8 @@
         <w:t xml:space="preserve">. The goal is to show how a simple histogram-based density rule can flag rare observations without fitting a forecasting model.</w:t>
       </w:r>
     </w:p>
-    <w:bookmarkEnd w:id="20"/>
-    <w:bookmarkStart w:id="21" w:name="method-at-a-glance"/>
+    <w:bookmarkEnd w:id="9"/>
+    <w:bookmarkStart w:id="10" w:name="method-at-a-glance"/>
     <w:p>
       <w:pPr>
         <w:pStyle w:val="Heading2"/>
@@ -58,8 +58,8 @@
         <w:t xml:space="preserve">builds a histogram of the observed values and labels points as anomalies when they fall into low-density bins or outside the observed bin range. It is a useful baseline because it focuses only on the empirical distribution of the series.</w:t>
       </w:r>
     </w:p>
-    <w:bookmarkEnd w:id="21"/>
-    <w:bookmarkStart w:id="34" w:name="what-you-will-do"/>
+    <w:bookmarkEnd w:id="10"/>
+    <w:bookmarkStart w:id="23" w:name="what-you-will-do"/>
     <w:p>
       <w:pPr>
         <w:pStyle w:val="Heading2"/>
@@ -137,7 +137,7 @@
         <w:t xml:space="preserve">har_plot()</w:t>
       </w:r>
     </w:p>
-    <w:bookmarkStart w:id="22" w:name="prepare-the-example"/>
+    <w:bookmarkStart w:id="11" w:name="prepare-the-example"/>
     <w:p>
       <w:pPr>
         <w:pStyle w:val="Heading3"/>
@@ -392,8 +392,8 @@
         <w:t xml:space="preserve">## 6 0.3153224 FALSE</w:t>
       </w:r>
     </w:p>
-    <w:bookmarkEnd w:id="22"/>
-    <w:bookmarkStart w:id="26" w:name="interpret-the-result-visually"/>
+    <w:bookmarkEnd w:id="11"/>
+    <w:bookmarkStart w:id="15" w:name="interpret-the-result-visually"/>
     <w:p>
       <w:pPr>
         <w:pStyle w:val="Heading3"/>
@@ -508,18 +508,18 @@
           <wp:inline>
             <wp:extent cx="4620126" cy="3696101"/>
             <wp:effectExtent b="0" l="0" r="0" t="0"/>
-            <wp:docPr descr="" title="" id="24" name="Picture"/>
+            <wp:docPr descr="" title="" id="13" name="Picture"/>
             <a:graphic>
               <a:graphicData uri="http://schemas.openxmlformats.org/drawingml/2006/picture">
                 <pic:pic>
                   <pic:nvPicPr>
-                    <pic:cNvPr descr="/home/gpca/harbinger/examples/anomalies/doc/01-baseline-hanr_histogram_files/figure-docx/unnamed-chunk-5-1.png" id="25" name="Picture"/>
+                    <pic:cNvPr descr="C:\Git\dal\harbinger\examples\anomalies\doc\01-baseline-hanr_histogram_files/0b7f82078ee9e44333559b67fecc1a26c1bb26d7.png" id="14" name="Picture"/>
                     <pic:cNvPicPr>
                       <a:picLocks noChangeArrowheads="1" noChangeAspect="1"/>
                     </pic:cNvPicPr>
                   </pic:nvPicPr>
                   <pic:blipFill>
-                    <a:blip r:embed="rId23"/>
+                    <a:blip r:embed="rId12"/>
                     <a:stretch>
                       <a:fillRect/>
                     </a:stretch>
@@ -546,8 +546,8 @@
         </w:drawing>
       </w:r>
     </w:p>
-    <w:bookmarkEnd w:id="26"/>
-    <w:bookmarkStart w:id="27" w:name="configure-the-method"/>
+    <w:bookmarkEnd w:id="15"/>
+    <w:bookmarkStart w:id="16" w:name="configure-the-method"/>
     <w:p>
       <w:pPr>
         <w:pStyle w:val="Heading3"/>
@@ -712,8 +712,8 @@
         <w:t xml:space="preserve">serie)</w:t>
       </w:r>
     </w:p>
-    <w:bookmarkEnd w:id="27"/>
-    <w:bookmarkStart w:id="28" w:name="run-the-core-analysis"/>
+    <w:bookmarkEnd w:id="16"/>
+    <w:bookmarkStart w:id="17" w:name="run-the-core-analysis"/>
     <w:p>
       <w:pPr>
         <w:pStyle w:val="Heading3"/>
@@ -907,8 +907,8 @@
         <w:t xml:space="preserve">## 2  50  TRUE anomaly</w:t>
       </w:r>
     </w:p>
-    <w:bookmarkEnd w:id="28"/>
-    <w:bookmarkStart w:id="29" w:name="evaluate-what-was-found"/>
+    <w:bookmarkEnd w:id="17"/>
+    <w:bookmarkStart w:id="18" w:name="evaluate-what-was-found"/>
     <w:p>
       <w:pPr>
         <w:pStyle w:val="Heading3"/>
@@ -1073,8 +1073,8 @@
         <w:t xml:space="preserve">## FALSE     0     99</w:t>
       </w:r>
     </w:p>
-    <w:bookmarkEnd w:id="29"/>
-    <w:bookmarkStart w:id="33" w:name="interpret-the-result-visually-1"/>
+    <w:bookmarkEnd w:id="18"/>
+    <w:bookmarkStart w:id="22" w:name="interpret-the-result-visually-1"/>
     <w:p>
       <w:pPr>
         <w:pStyle w:val="Heading3"/>
@@ -1150,18 +1150,18 @@
           <wp:inline>
             <wp:extent cx="4620126" cy="3696101"/>
             <wp:effectExtent b="0" l="0" r="0" t="0"/>
-            <wp:docPr descr="" title="" id="31" name="Picture"/>
+            <wp:docPr descr="" title="" id="20" name="Picture"/>
             <a:graphic>
               <a:graphicData uri="http://schemas.openxmlformats.org/drawingml/2006/picture">
                 <pic:pic>
                   <pic:nvPicPr>
-                    <pic:cNvPr descr="/home/gpca/harbinger/examples/anomalies/doc/01-baseline-hanr_histogram_files/figure-docx/unnamed-chunk-11-1.png" id="32" name="Picture"/>
+                    <pic:cNvPr descr="C:\Git\dal\harbinger\examples\anomalies\doc\01-baseline-hanr_histogram_files/f23162fda4f68fbb9dc03f4a96b8b47d7ba4df47.png" id="21" name="Picture"/>
                     <pic:cNvPicPr>
                       <a:picLocks noChangeArrowheads="1" noChangeAspect="1"/>
                     </pic:cNvPicPr>
                   </pic:nvPicPr>
                   <pic:blipFill>
-                    <a:blip r:embed="rId30"/>
+                    <a:blip r:embed="rId19"/>
                     <a:stretch>
                       <a:fillRect/>
                     </a:stretch>
@@ -1188,9 +1188,9 @@
         </w:drawing>
       </w:r>
     </w:p>
-    <w:bookmarkEnd w:id="33"/>
-    <w:bookmarkEnd w:id="34"/>
-    <w:bookmarkStart w:id="36" w:name="references"/>
+    <w:bookmarkEnd w:id="22"/>
+    <w:bookmarkEnd w:id="23"/>
+    <w:bookmarkStart w:id="25" w:name="references"/>
     <w:p>
       <w:pPr>
         <w:pStyle w:val="Heading2"/>
@@ -1213,7 +1213,7 @@
       <w:r>
         <w:t xml:space="preserve"> </w:t>
       </w:r>
-      <w:hyperlink r:id="rId35">
+      <w:hyperlink r:id="rId24">
         <w:r>
           <w:rPr>
             <w:rStyle w:val="Hyperlink"/>
@@ -1222,7 +1222,7 @@
         </w:r>
       </w:hyperlink>
     </w:p>
-    <w:bookmarkEnd w:id="36"/>
+    <w:bookmarkEnd w:id="25"/>
     <w:sectPr>
       <w:footnotePr>
         <w:numRestart w:val="eachSect"/>
@@ -1453,10 +1453,10 @@
   <w:docDefaults>
     <w:rPrDefault>
       <w:rPr>
-        <w:rFonts w:asciiTheme="minorHAnsi" w:cstheme="minorBidi" w:eastAsiaTheme="minorHAnsi" w:hAnsiTheme="minorHAnsi"/>
+        <w:rFonts w:asciiTheme="minorHAnsi" w:cstheme="minorBidi" w:eastAsiaTheme="minorEastAsia" w:hAnsiTheme="minorHAnsi"/>
         <w:sz w:val="24"/>
         <w:szCs w:val="24"/>
-        <w:lang w:bidi="ar-SA" w:eastAsia="en-US" w:val="en-US"/>
+        <w:lang w:bidi="ar-SA" w:eastAsia="zh-CN" w:val="en-US"/>
       </w:rPr>
     </w:rPrDefault>
     <w:pPrDefault>
@@ -1997,13 +1997,6 @@
       </w:tblCellMar>
     </w:tblPr>
     <w:tblStylePr w:type="firstRow">
-      <w:tblPr>
-        <w:jc w:val="left"/>
-        <w:tblInd w:type="dxa" w:w="0"/>
-      </w:tblPr>
-      <w:trPr>
-        <w:jc w:val="left"/>
-      </w:trPr>
       <w:tcPr>
         <w:tcBorders>
           <w:bottom w:val="single"/>

</xml_diff>